<commit_message>
Day 3: Call Intake & Data Extraction, the task in cards, then the six calls on one slide, Next to the Knowledge Check
The PI Reception Activity is renamed Call Intake & Data Extraction and split in two slides:
- s1c: the simulation in a line, then cards: 1 Listen, 2 Analyze, 3 Extract; the 5 data points beside
  "Analyze the call's challenge" (the obstacle, the VA's response); the worksheet and its naming convention
- s1d: the six recordings together, whose Next is the day's Knowledge Check (KC_NEXT, back to the
  CRM/CMS homework after it)
The worksheet gets two reflection rows per call (the obstacle, the VA's response); the trainer's
cues, the card row and the README follow the new name.

Co-Authored-By: Claude Opus 5.5 <noreply@anthropic.com>
Claude-Session: https://claude.ai/code/session_0136HbZbGaN3fuVQAy9XygDy
</commit_message>
<xml_diff>
--- a/handouts/LSH_Day3_PI_Reception_Activity_Worksheet.docx
+++ b/handouts/LSH_Day3_PI_Reception_Activity_Worksheet.docx
@@ -7,7 +7,7 @@
         <w:pStyle w:val="Title"/>
       </w:pPr>
       <w:r>
-        <w:t>PI Reception Activity: 6 Practice Calls</w:t>
+        <w:t>Call Intake &amp; Data Extraction: 6 Practice Calls</w:t>
       </w:r>
     </w:p>
     <w:p>
@@ -17,7 +17,7 @@
     </w:p>
     <w:p>
       <w:r>
-        <w:t>Listen to each call on the Day 3 slide and fill in its 5 data points, then the call's challenge: what made it hard, and what the VA did about it.</w:t>
+        <w:t>Listen to each call on the Day 3 slide and fill in its 5 data points, then reflect on the call's challenge: the obstacle (what made the call difficult) and the VA's response (how the receptionist handled it).</w:t>
       </w:r>
     </w:p>
     <w:p>
@@ -184,7 +184,33 @@
               <w:rPr>
                 <w:b/>
               </w:rPr>
-              <w:t>The challenge, and how the VA handled it</w:t>
+              <w:t>Reflection: the obstacle (what made the call difficult)</w:t>
+            </w:r>
+          </w:p>
+        </w:tc>
+        <w:tc>
+          <w:tcPr>
+            <w:tcW w:type="dxa" w:w="6000"/>
+          </w:tcPr>
+          <w:p>
+            <w:r>
+              <w:br/>
+            </w:r>
+          </w:p>
+        </w:tc>
+      </w:tr>
+      <w:tr>
+        <w:tc>
+          <w:tcPr>
+            <w:tcW w:type="dxa" w:w="3400"/>
+            <w:shd w:val="clear" w:color="auto" w:fill="E8EBF5"/>
+          </w:tcPr>
+          <w:p>
+            <w:r>
+              <w:rPr>
+                <w:b/>
+              </w:rPr>
+              <w:t>Reflection: the VA's response (how the receptionist handled it)</w:t>
             </w:r>
           </w:p>
         </w:tc>
@@ -359,7 +385,33 @@
               <w:rPr>
                 <w:b/>
               </w:rPr>
-              <w:t>The challenge, and how the VA handled it</w:t>
+              <w:t>Reflection: the obstacle (what made the call difficult)</w:t>
+            </w:r>
+          </w:p>
+        </w:tc>
+        <w:tc>
+          <w:tcPr>
+            <w:tcW w:type="dxa" w:w="6000"/>
+          </w:tcPr>
+          <w:p>
+            <w:r>
+              <w:br/>
+            </w:r>
+          </w:p>
+        </w:tc>
+      </w:tr>
+      <w:tr>
+        <w:tc>
+          <w:tcPr>
+            <w:tcW w:type="dxa" w:w="3400"/>
+            <w:shd w:val="clear" w:color="auto" w:fill="E8EBF5"/>
+          </w:tcPr>
+          <w:p>
+            <w:r>
+              <w:rPr>
+                <w:b/>
+              </w:rPr>
+              <w:t>Reflection: the VA's response (how the receptionist handled it)</w:t>
             </w:r>
           </w:p>
         </w:tc>
@@ -534,7 +586,33 @@
               <w:rPr>
                 <w:b/>
               </w:rPr>
-              <w:t>The challenge, and how the VA handled it</w:t>
+              <w:t>Reflection: the obstacle (what made the call difficult)</w:t>
+            </w:r>
+          </w:p>
+        </w:tc>
+        <w:tc>
+          <w:tcPr>
+            <w:tcW w:type="dxa" w:w="6000"/>
+          </w:tcPr>
+          <w:p>
+            <w:r>
+              <w:br/>
+            </w:r>
+          </w:p>
+        </w:tc>
+      </w:tr>
+      <w:tr>
+        <w:tc>
+          <w:tcPr>
+            <w:tcW w:type="dxa" w:w="3400"/>
+            <w:shd w:val="clear" w:color="auto" w:fill="E8EBF5"/>
+          </w:tcPr>
+          <w:p>
+            <w:r>
+              <w:rPr>
+                <w:b/>
+              </w:rPr>
+              <w:t>Reflection: the VA's response (how the receptionist handled it)</w:t>
             </w:r>
           </w:p>
         </w:tc>
@@ -709,7 +787,33 @@
               <w:rPr>
                 <w:b/>
               </w:rPr>
-              <w:t>The challenge, and how the VA handled it</w:t>
+              <w:t>Reflection: the obstacle (what made the call difficult)</w:t>
+            </w:r>
+          </w:p>
+        </w:tc>
+        <w:tc>
+          <w:tcPr>
+            <w:tcW w:type="dxa" w:w="6000"/>
+          </w:tcPr>
+          <w:p>
+            <w:r>
+              <w:br/>
+            </w:r>
+          </w:p>
+        </w:tc>
+      </w:tr>
+      <w:tr>
+        <w:tc>
+          <w:tcPr>
+            <w:tcW w:type="dxa" w:w="3400"/>
+            <w:shd w:val="clear" w:color="auto" w:fill="E8EBF5"/>
+          </w:tcPr>
+          <w:p>
+            <w:r>
+              <w:rPr>
+                <w:b/>
+              </w:rPr>
+              <w:t>Reflection: the VA's response (how the receptionist handled it)</w:t>
             </w:r>
           </w:p>
         </w:tc>
@@ -884,7 +988,33 @@
               <w:rPr>
                 <w:b/>
               </w:rPr>
-              <w:t>The challenge, and how the VA handled it</w:t>
+              <w:t>Reflection: the obstacle (what made the call difficult)</w:t>
+            </w:r>
+          </w:p>
+        </w:tc>
+        <w:tc>
+          <w:tcPr>
+            <w:tcW w:type="dxa" w:w="6000"/>
+          </w:tcPr>
+          <w:p>
+            <w:r>
+              <w:br/>
+            </w:r>
+          </w:p>
+        </w:tc>
+      </w:tr>
+      <w:tr>
+        <w:tc>
+          <w:tcPr>
+            <w:tcW w:type="dxa" w:w="3400"/>
+            <w:shd w:val="clear" w:color="auto" w:fill="E8EBF5"/>
+          </w:tcPr>
+          <w:p>
+            <w:r>
+              <w:rPr>
+                <w:b/>
+              </w:rPr>
+              <w:t>Reflection: the VA's response (how the receptionist handled it)</w:t>
             </w:r>
           </w:p>
         </w:tc>
@@ -1059,7 +1189,33 @@
               <w:rPr>
                 <w:b/>
               </w:rPr>
-              <w:t>The challenge, and how the VA handled it</w:t>
+              <w:t>Reflection: the obstacle (what made the call difficult)</w:t>
+            </w:r>
+          </w:p>
+        </w:tc>
+        <w:tc>
+          <w:tcPr>
+            <w:tcW w:type="dxa" w:w="6000"/>
+          </w:tcPr>
+          <w:p>
+            <w:r>
+              <w:br/>
+            </w:r>
+          </w:p>
+        </w:tc>
+      </w:tr>
+      <w:tr>
+        <w:tc>
+          <w:tcPr>
+            <w:tcW w:type="dxa" w:w="3400"/>
+            <w:shd w:val="clear" w:color="auto" w:fill="E8EBF5"/>
+          </w:tcPr>
+          <w:p>
+            <w:r>
+              <w:rPr>
+                <w:b/>
+              </w:rPr>
+              <w:t>Reflection: the VA's response (how the receptionist handled it)</w:t>
             </w:r>
           </w:p>
         </w:tc>

</xml_diff>

<commit_message>
Day 3 PI reception calls 1-5: Oscar's five reception recordings redone for Harbor & Pine
Recreates VA Oscar's five clinic reception calls as personal injury calls at the
fictional firm (fictional names, dates and 555-01xx numbers): a wrong birth year
and a missing appointment email, a frustrated third call about a Letter of
Protection, an imaging centre's fax with no name given, a short confirmation, and
a ride that fell through (warm transfer to the case manager). New audio, answer
keys, transcripts, worksheet and challenge icons; call 6 unchanged.

Co-Authored-By: Claude Opus 5.5 <noreply@anthropic.com>
Claude-Session: https://claude.ai/code/session_0136HbZbUcQNLkmQW4KvSqiX
</commit_message>
<xml_diff>
--- a/handouts/LSH_Day3_PI_Reception_Activity_Worksheet.docx
+++ b/handouts/LSH_Day3_PI_Reception_Activity_Worksheet.docx
@@ -30,7 +30,7 @@
         <w:pStyle w:val="Heading2"/>
       </w:pPr>
       <w:r>
-        <w:t>Call 1: The Tow Yard  (Background noise)</w:t>
+        <w:t>Call 1: The Missing Email  (Mixed-up details)</w:t>
       </w:r>
     </w:p>
     <w:tbl>
@@ -231,7 +231,7 @@
         <w:pStyle w:val="Heading2"/>
       </w:pPr>
       <w:r>
-        <w:t>Call 2: Breaking Up on the Highway  (Connection issues)</w:t>
+        <w:t>Call 2: Third Time Calling  (A frustrated repeat caller)</w:t>
       </w:r>
     </w:p>
     <w:tbl>
@@ -432,7 +432,7 @@
         <w:pStyle w:val="Heading2"/>
       </w:pPr>
       <w:r>
-        <w:t>Call 3: Hablo Poquito Inglés  (Language barrier)</w:t>
+        <w:t>Call 3: Which Office?  (An unclear request)</w:t>
       </w:r>
     </w:p>
     <w:tbl>
@@ -633,7 +633,7 @@
         <w:pStyle w:val="Heading2"/>
       </w:pPr>
       <w:r>
-        <w:t>Call 4: The Speakerphone Echo  (Poor audio quality)</w:t>
+        <w:t>Call 4: Just Confirming  (A short call)</w:t>
       </w:r>
     </w:p>
     <w:tbl>
@@ -834,7 +834,7 @@
         <w:pStyle w:val="Heading2"/>
       </w:pPr>
       <w:r>
-        <w:t>Call 5: The Fast-Talking Adjuster  (Background noise and a fast talker)</w:t>
+        <w:t>Call 5: No Ride Tomorrow  (Rescheduling and a warm transfer)</w:t>
       </w:r>
     </w:p>
     <w:tbl>

</xml_diff>

<commit_message>
Day 3 PI reception calls: remove call 6 (Mom on the Line)
The activity is now Oscar's five calls redone for Harbor & Pine: call 6's script
and audio removed, and 'six/6 practice calls' made five on the slides, the
worksheet, the trainer's cues and key, and the README.

Co-Authored-By: Claude Opus 5.5 <noreply@anthropic.com>
Claude-Session: https://claude.ai/code/session_0136HbZbUcQNLkmQW4KvSqiX
</commit_message>
<xml_diff>
--- a/handouts/LSH_Day3_PI_Reception_Activity_Worksheet.docx
+++ b/handouts/LSH_Day3_PI_Reception_Activity_Worksheet.docx
@@ -7,7 +7,7 @@
         <w:pStyle w:val="Title"/>
       </w:pPr>
       <w:r>
-        <w:t>Call Intake &amp; Data Extraction: 6 Practice Calls</w:t>
+        <w:t>Call Intake &amp; Data Extraction: 5 Practice Calls</w:t>
       </w:r>
     </w:p>
     <w:p>
@@ -1030,207 +1030,6 @@
         </w:tc>
       </w:tr>
     </w:tbl>
-    <w:p>
-      <w:pPr>
-        <w:pStyle w:val="Heading2"/>
-      </w:pPr>
-      <w:r>
-        <w:t>Call 6: Mom on the Line  (Background noise and an unauthorized caller)</w:t>
-      </w:r>
-    </w:p>
-    <w:tbl>
-      <w:tblPr>
-        <w:tblStyle w:val="TableGrid"/>
-        <w:tblW w:type="auto" w:w="0"/>
-        <w:tblLook w:firstColumn="1" w:firstRow="1" w:lastColumn="0" w:lastRow="0" w:noHBand="0" w:noVBand="1" w:val="04A0"/>
-      </w:tblPr>
-      <w:tblGrid>
-        <w:gridCol w:w="4320"/>
-        <w:gridCol w:w="4320"/>
-      </w:tblGrid>
-      <w:tr>
-        <w:tc>
-          <w:tcPr>
-            <w:tcW w:type="dxa" w:w="3400"/>
-            <w:shd w:val="clear" w:color="auto" w:fill="E8EBF5"/>
-          </w:tcPr>
-          <w:p>
-            <w:r>
-              <w:rPr>
-                <w:b/>
-              </w:rPr>
-              <w:t>1. Caller (name, and who they are)</w:t>
-            </w:r>
-          </w:p>
-        </w:tc>
-        <w:tc>
-          <w:tcPr>
-            <w:tcW w:type="dxa" w:w="6000"/>
-          </w:tcPr>
-          <w:p>
-            <w:r>
-              <w:br/>
-            </w:r>
-          </w:p>
-        </w:tc>
-      </w:tr>
-      <w:tr>
-        <w:tc>
-          <w:tcPr>
-            <w:tcW w:type="dxa" w:w="3400"/>
-            <w:shd w:val="clear" w:color="auto" w:fill="E8EBF5"/>
-          </w:tcPr>
-          <w:p>
-            <w:r>
-              <w:rPr>
-                <w:b/>
-              </w:rPr>
-              <w:t>2. Callback number</w:t>
-            </w:r>
-          </w:p>
-        </w:tc>
-        <w:tc>
-          <w:tcPr>
-            <w:tcW w:type="dxa" w:w="6000"/>
-          </w:tcPr>
-          <w:p>
-            <w:r>
-              <w:br/>
-            </w:r>
-          </w:p>
-        </w:tc>
-      </w:tr>
-      <w:tr>
-        <w:tc>
-          <w:tcPr>
-            <w:tcW w:type="dxa" w:w="3400"/>
-            <w:shd w:val="clear" w:color="auto" w:fill="E8EBF5"/>
-          </w:tcPr>
-          <w:p>
-            <w:r>
-              <w:rPr>
-                <w:b/>
-              </w:rPr>
-              <w:t>3. Verified? (how, or why nothing could be shared)</w:t>
-            </w:r>
-          </w:p>
-        </w:tc>
-        <w:tc>
-          <w:tcPr>
-            <w:tcW w:type="dxa" w:w="6000"/>
-          </w:tcPr>
-          <w:p>
-            <w:r>
-              <w:br/>
-            </w:r>
-          </w:p>
-        </w:tc>
-      </w:tr>
-      <w:tr>
-        <w:tc>
-          <w:tcPr>
-            <w:tcW w:type="dxa" w:w="3400"/>
-            <w:shd w:val="clear" w:color="auto" w:fill="E8EBF5"/>
-          </w:tcPr>
-          <w:p>
-            <w:r>
-              <w:rPr>
-                <w:b/>
-              </w:rPr>
-              <w:t>4. Reason for the call</w:t>
-            </w:r>
-          </w:p>
-        </w:tc>
-        <w:tc>
-          <w:tcPr>
-            <w:tcW w:type="dxa" w:w="6000"/>
-          </w:tcPr>
-          <w:p>
-            <w:r>
-              <w:br/>
-            </w:r>
-          </w:p>
-        </w:tc>
-      </w:tr>
-      <w:tr>
-        <w:tc>
-          <w:tcPr>
-            <w:tcW w:type="dxa" w:w="3400"/>
-            <w:shd w:val="clear" w:color="auto" w:fill="E8EBF5"/>
-          </w:tcPr>
-          <w:p>
-            <w:r>
-              <w:rPr>
-                <w:b/>
-              </w:rPr>
-              <w:t>5. Action taken (who it went to, and how)</w:t>
-            </w:r>
-          </w:p>
-        </w:tc>
-        <w:tc>
-          <w:tcPr>
-            <w:tcW w:type="dxa" w:w="6000"/>
-          </w:tcPr>
-          <w:p>
-            <w:r>
-              <w:br/>
-            </w:r>
-          </w:p>
-        </w:tc>
-      </w:tr>
-      <w:tr>
-        <w:tc>
-          <w:tcPr>
-            <w:tcW w:type="dxa" w:w="3400"/>
-            <w:shd w:val="clear" w:color="auto" w:fill="E8EBF5"/>
-          </w:tcPr>
-          <w:p>
-            <w:r>
-              <w:rPr>
-                <w:b/>
-              </w:rPr>
-              <w:t>Reflection: the obstacle (what made the call difficult)</w:t>
-            </w:r>
-          </w:p>
-        </w:tc>
-        <w:tc>
-          <w:tcPr>
-            <w:tcW w:type="dxa" w:w="6000"/>
-          </w:tcPr>
-          <w:p>
-            <w:r>
-              <w:br/>
-            </w:r>
-          </w:p>
-        </w:tc>
-      </w:tr>
-      <w:tr>
-        <w:tc>
-          <w:tcPr>
-            <w:tcW w:type="dxa" w:w="3400"/>
-            <w:shd w:val="clear" w:color="auto" w:fill="E8EBF5"/>
-          </w:tcPr>
-          <w:p>
-            <w:r>
-              <w:rPr>
-                <w:b/>
-              </w:rPr>
-              <w:t>Reflection: the VA's response (how the receptionist handled it)</w:t>
-            </w:r>
-          </w:p>
-        </w:tc>
-        <w:tc>
-          <w:tcPr>
-            <w:tcW w:type="dxa" w:w="6000"/>
-          </w:tcPr>
-          <w:p>
-            <w:r>
-              <w:br/>
-            </w:r>
-          </w:p>
-        </w:tc>
-      </w:tr>
-    </w:tbl>
     <w:p/>
     <w:p>
       <w:r>

</xml_diff>

<commit_message>
Day 3: the Harbor & Pine calls with line noise back, Oscar's recordings off, Reception Listening Activity
- The five PI practice calls are the ones with a challenge on the line again
  (road noise at a tow yard, a line that breaks up and drops, a Spanish-speaking
  caller, a speakerphone echo, a fast-talking adjuster in a loud call centre;
  VA Rina / Paolo), restored from before they were redone from VA Oscar's
  recordings. Call 6 stays off. The trainer's key and the Word worksheet are
  rebuilt from them.
- No recording of VA Oscar's anywhere: off the Listening Activity slide and its
  build check, the trainer's cue and the day's activity list.
- "Call Intake & Data Extraction" is now "Reception Listening Activity"
  everywhere; its task slide's text is bolder and darker; its worksheet tile
  opens the combined Knowledge Check (Lesson 4).

Co-Authored-By: Claude Opus 5.5 <noreply@anthropic.com>
Claude-Session: https://claude.ai/code/session_0136HbZauMAoDuFHYqbSukpA
</commit_message>
<xml_diff>
--- a/handouts/LSH_Day3_PI_Reception_Activity_Worksheet.docx
+++ b/handouts/LSH_Day3_PI_Reception_Activity_Worksheet.docx
@@ -7,7 +7,7 @@
         <w:pStyle w:val="Title"/>
       </w:pPr>
       <w:r>
-        <w:t>Call Intake &amp; Data Extraction: 5 Practice Calls</w:t>
+        <w:t>Reception Listening Activity: 5 Practice Calls</w:t>
       </w:r>
     </w:p>
     <w:p>
@@ -30,7 +30,7 @@
         <w:pStyle w:val="Heading2"/>
       </w:pPr>
       <w:r>
-        <w:t>Call 1: The Missing Email  (Mixed-up details)</w:t>
+        <w:t>Call 1: The Tow Yard  (Background noise)</w:t>
       </w:r>
     </w:p>
     <w:tbl>
@@ -231,7 +231,7 @@
         <w:pStyle w:val="Heading2"/>
       </w:pPr>
       <w:r>
-        <w:t>Call 2: Third Time Calling  (A frustrated repeat caller)</w:t>
+        <w:t>Call 2: Breaking Up on the Highway  (Connection issues)</w:t>
       </w:r>
     </w:p>
     <w:tbl>
@@ -432,7 +432,7 @@
         <w:pStyle w:val="Heading2"/>
       </w:pPr>
       <w:r>
-        <w:t>Call 3: Which Office?  (An unclear request)</w:t>
+        <w:t>Call 3: Hablo Poquito Inglés  (Language barrier)</w:t>
       </w:r>
     </w:p>
     <w:tbl>
@@ -633,7 +633,7 @@
         <w:pStyle w:val="Heading2"/>
       </w:pPr>
       <w:r>
-        <w:t>Call 4: Just Confirming  (A short call)</w:t>
+        <w:t>Call 4: The Speakerphone Echo  (Poor audio quality)</w:t>
       </w:r>
     </w:p>
     <w:tbl>
@@ -834,7 +834,7 @@
         <w:pStyle w:val="Heading2"/>
       </w:pPr>
       <w:r>
-        <w:t>Call 5: No Ride Tomorrow  (Rescheduling and a warm transfer)</w:t>
+        <w:t>Call 5: The Fast-Talking Adjuster  (Background noise and a fast talker)</w:t>
       </w:r>
     </w:p>
     <w:tbl>

</xml_diff>

<commit_message>
Day 3 Reception Listening Activity: its own, newer set of calls back
The activity plays the newer Harbor & Pine set again (VA Oscar's five
reception recordings redone as PI calls: The Missing Email, Third Time
Calling, Which Office?, Just Confirming, No Ride Tomorrow), with its trainer's
key and Word worksheet. The calls with a challenge on the line stay the
optional Listening Activity, in place of Carlos's recordings.

Co-Authored-By: Claude Opus 5.5 <noreply@anthropic.com>
Claude-Session: https://claude.ai/code/session_0136HbZZjbG8mMj2hmXKsUmt
</commit_message>
<xml_diff>
--- a/handouts/LSH_Day3_PI_Reception_Activity_Worksheet.docx
+++ b/handouts/LSH_Day3_PI_Reception_Activity_Worksheet.docx
@@ -30,7 +30,7 @@
         <w:pStyle w:val="Heading2"/>
       </w:pPr>
       <w:r>
-        <w:t>Call 1: The Tow Yard  (Background noise)</w:t>
+        <w:t>Call 1: The Missing Email  (Mixed-up details)</w:t>
       </w:r>
     </w:p>
     <w:tbl>
@@ -231,7 +231,7 @@
         <w:pStyle w:val="Heading2"/>
       </w:pPr>
       <w:r>
-        <w:t>Call 2: Breaking Up on the Highway  (Connection issues)</w:t>
+        <w:t>Call 2: Third Time Calling  (A frustrated repeat caller)</w:t>
       </w:r>
     </w:p>
     <w:tbl>
@@ -432,7 +432,7 @@
         <w:pStyle w:val="Heading2"/>
       </w:pPr>
       <w:r>
-        <w:t>Call 3: Hablo Poquito Inglés  (Language barrier)</w:t>
+        <w:t>Call 3: Which Office?  (An unclear request)</w:t>
       </w:r>
     </w:p>
     <w:tbl>
@@ -633,7 +633,7 @@
         <w:pStyle w:val="Heading2"/>
       </w:pPr>
       <w:r>
-        <w:t>Call 4: The Speakerphone Echo  (Poor audio quality)</w:t>
+        <w:t>Call 4: Just Confirming  (A short call)</w:t>
       </w:r>
     </w:p>
     <w:tbl>
@@ -834,7 +834,7 @@
         <w:pStyle w:val="Heading2"/>
       </w:pPr>
       <w:r>
-        <w:t>Call 5: The Fast-Talking Adjuster  (Background noise and a fast talker)</w:t>
+        <w:t>Call 5: No Ride Tomorrow  (Rescheduling and a warm transfer)</w:t>
       </w:r>
     </w:p>
     <w:tbl>

</xml_diff>